<commit_message>
feat: rebuild both dashboards around what needs action
User dashboard: the header is a today-only summary (open tasks + minutes left)
patched live from the cards, missed periods collapse into one divided card with
a chip per period, and a "Ritme 14 hari" section replaces the three stat cards
that repeated numbers already on the page.

Admin dashboard: a "Perlu perhatian" strip built from real gaps, four linked
stat cards with coverage meters, per-unit coverage, a 7-day login chart and the
latest logins/posts.

Shared: StatCard gains href/meter, BarChart moves to components/ui, formatDate
returns "-" on bad input, formatMinutes is shared by server and client.
</commit_message>
<xml_diff>
--- a/docs/proposal-pengembangan-produk.docx
+++ b/docs/proposal-pengembangan-produk.docx
@@ -21,7 +21,7 @@
         <w:rPr>
           <w:lang w:val="id"/>
         </w:rPr>
-        <w:t xml:space="preserve">Aplikasi Penugasan Unit Kerja (Better Belt)</w:t>
+        <w:t xml:space="preserve">Aplikasi Penugasan Unit Kerja (Umsura Assignment)</w:t>
       </w:r>
     </w:p>
     <w:p>
@@ -32,7 +32,7 @@
         <w:rPr>
           <w:lang w:val="id"/>
         </w:rPr>
-        <w:t xml:space="preserve">Tim Pengembang Better Belt</w:t>
+        <w:t xml:space="preserve">Tim Pengembang Umsura Assignment</w:t>
       </w:r>
     </w:p>
     <w:p>
@@ -80,19 +80,23 @@
           <w:bCs/>
           <w:lang w:val="id"/>
         </w:rPr>
-        <w:t xml:space="preserve">“Aplikasi Penugasan Unit Kerja (Better Belt)”</w:t>
-      </w:r>
-      <w:r>
-        <w:rPr>
+        <w:t xml:space="preserve">“Aplikasi Penugasan Unit Kerja (Umsura</w:t>
+      </w:r>
+      <w:r>
+        <w:rPr>
+          <w:b/>
+          <w:bCs/>
           <w:lang w:val="id"/>
         </w:rPr>
         <w:t xml:space="preserve"> </w:t>
       </w:r>
       <w:r>
         <w:rPr>
-          <w:lang w:val="id"/>
-        </w:rPr>
-        <w:t xml:space="preserve">disusun sebagai dokumen perencanaan pengembangan produk yang memuat latar belakang,</w:t>
+          <w:b/>
+          <w:bCs/>
+          <w:lang w:val="id"/>
+        </w:rPr>
+        <w:t xml:space="preserve">Assignment)”</w:t>
       </w:r>
       <w:r>
         <w:rPr>
@@ -104,7 +108,7 @@
         <w:rPr>
           <w:lang w:val="id"/>
         </w:rPr>
-        <w:t xml:space="preserve">rumusan masalah, tujuan, pemilihan solusi dan teknik, skenario pemanfaatan, serta</w:t>
+        <w:t xml:space="preserve">disusun sebagai dokumen perencanaan pengembangan produk yang memuat</w:t>
       </w:r>
       <w:r>
         <w:rPr>
@@ -116,7 +120,19 @@
         <w:rPr>
           <w:lang w:val="id"/>
         </w:rPr>
-        <w:t xml:space="preserve">kebutuhan sumber daya pengembangan.</w:t>
+        <w:t xml:space="preserve">latar belakang, rumusan masalah, tujuan, pemilihan solusi dan teknik, skenario</w:t>
+      </w:r>
+      <w:r>
+        <w:rPr>
+          <w:lang w:val="id"/>
+        </w:rPr>
+        <w:t xml:space="preserve"> </w:t>
+      </w:r>
+      <w:r>
+        <w:rPr>
+          <w:lang w:val="id"/>
+        </w:rPr>
+        <w:t xml:space="preserve">pemanfaatan, serta kebutuhan sumber daya pengembangan.</w:t>
       </w:r>
     </w:p>
     <w:tbl>
@@ -861,7 +877,7 @@
         <w:rPr>
           <w:lang w:val="id"/>
         </w:rPr>
-        <w:t xml:space="preserve">Proposal ini berkembang melalui pengembangan aplikasi Better Belt, sebuah aplikasi web</w:t>
+        <w:t xml:space="preserve">Proposal ini berkembang melalui pengembangan aplikasi Umsura Assignment, sebuah</w:t>
       </w:r>
       <w:r>
         <w:rPr>
@@ -873,7 +889,19 @@
         <w:rPr>
           <w:lang w:val="id"/>
         </w:rPr>
-        <w:t xml:space="preserve">penugasan unit kerja yang menerjemahkan setiap penugasan menjadi kemunculan per periode.</w:t>
+        <w:t xml:space="preserve">aplikasi web penugasan unit kerja yang menerjemahkan setiap penugasan menjadi kemunculan</w:t>
+      </w:r>
+      <w:r>
+        <w:rPr>
+          <w:lang w:val="id"/>
+        </w:rPr>
+        <w:t xml:space="preserve"> </w:t>
+      </w:r>
+      <w:r>
+        <w:rPr>
+          <w:lang w:val="id"/>
+        </w:rPr>
+        <w:t xml:space="preserve">per periode.</w:t>
       </w:r>
       <w:r>
         <w:rPr>
@@ -1069,13 +1097,13 @@
         <w:rPr>
           <w:lang w:val="id"/>
         </w:rPr>
-        <w:t xml:space="preserve">“Aplikasi Penugasan Unit Kerja (Better Belt)”</w:t>
-      </w:r>
-      <w:r>
-        <w:rPr>
-          <w:lang w:val="id"/>
-        </w:rPr>
-        <w:t xml:space="preserve">. Pada</w:t>
+        <w:t xml:space="preserve">“Aplikasi Penugasan Unit Kerja (Umsura Assignment)”</w:t>
+      </w:r>
+      <w:r>
+        <w:rPr>
+          <w:lang w:val="id"/>
+        </w:rPr>
+        <w:t xml:space="preserve">.</w:t>
       </w:r>
       <w:r>
         <w:rPr>
@@ -1087,7 +1115,7 @@
         <w:rPr>
           <w:lang w:val="id"/>
         </w:rPr>
-        <w:t xml:space="preserve">kesempatan ini, tim penyusun menyampaikan terima kasih kepada para pembimbing yang</w:t>
+        <w:t xml:space="preserve">Pada kesempatan ini, tim penyusun menyampaikan terima kasih kepada para pembimbing yang</w:t>
       </w:r>
       <w:r>
         <w:rPr>
@@ -2320,7 +2348,7 @@
           <w:bCs/>
           <w:lang w:val="id"/>
         </w:rPr>
-        <w:t xml:space="preserve">Better Belt</w:t>
+        <w:t xml:space="preserve">Umsura Assignment</w:t>
       </w:r>
       <w:r>
         <w:rPr>
@@ -3453,7 +3481,7 @@
               <w:rPr>
                 <w:lang w:val="id"/>
               </w:rPr>
-              <w:t xml:space="preserve">Kode sumber aplikasi Better Belt, 5.485 baris kode pada 44 berkas</w:t>
+              <w:t xml:space="preserve">Kode sumber aplikasi Umsura Assignment, 5.485 baris kode pada 44 berkas</w:t>
             </w:r>
           </w:p>
         </w:tc>
@@ -7084,7 +7112,7 @@
         <w:rPr>
           <w:lang w:val="id"/>
         </w:rPr>
-        <w:t xml:space="preserve">Better Belt menyediakan satu aplikasi web yang menyatukan katalog aktivitas, penugasan,</w:t>
+        <w:t xml:space="preserve">Umsura Assignment menyediakan satu aplikasi web yang menyatukan katalog aktivitas,</w:t>
       </w:r>
       <w:r>
         <w:rPr>
@@ -7096,7 +7124,7 @@
         <w:rPr>
           <w:lang w:val="id"/>
         </w:rPr>
-        <w:t xml:space="preserve">danbumusan tempat bekerja. Admin menetapkan aktivitas kepada orang; aplikasi</w:t>
+        <w:t xml:space="preserve">penugasan, danbumusan tempat bekerja. Admin menetapkan aktivitas kepada orang; aplikasi</w:t>
       </w:r>
       <w:r>
         <w:rPr>
@@ -16556,7 +16584,7 @@
               <w:rPr>
                 <w:lang w:val="id"/>
               </w:rPr>
-              <w:t xml:space="preserve">Manfaat dari Better Belt</w:t>
+              <w:t xml:space="preserve">Manfaat dari Umsura Assignment</w:t>
             </w:r>
           </w:p>
         </w:tc>
@@ -22300,7 +22328,7 @@
         <w:rPr>
           <w:lang w:val="id"/>
         </w:rPr>
-        <w:t xml:space="preserve">Server dipakai bersama dengan layanan kampus lain. Beban Better Belt diperkirakan</w:t>
+        <w:t xml:space="preserve">Server dipakai bersama dengan layanan kampus lain. Beban Umsura Assignment</w:t>
       </w:r>
       <w:r>
         <w:rPr>
@@ -22312,7 +22340,7 @@
         <w:rPr>
           <w:lang w:val="id"/>
         </w:rPr>
-        <w:t xml:space="preserve">di bawah 10 persen kapasitas CPU dan penyimpanan.</w:t>
+        <w:t xml:space="preserve">diperkirakan di bawah 10 persen kapasitas CPU dan penyimpanan.</w:t>
       </w:r>
     </w:p>
     <w:p>
@@ -29650,7 +29678,7 @@
         <w:rPr>
           <w:lang w:val="id"/>
         </w:rPr>
-        <w:t xml:space="preserve">Proposal ini menghasilkan sebuah produk bernama Better Belt, aplikasi penugasan unit</w:t>
+        <w:t xml:space="preserve">Proposal ini menghasilkan sebuah produk bernama Umsura Assignment, aplikasi penugasan</w:t>
       </w:r>
       <w:r>
         <w:rPr>
@@ -29662,7 +29690,7 @@
         <w:rPr>
           <w:lang w:val="id"/>
         </w:rPr>
-        <w:t xml:space="preserve">kerja yang mengubah MPP, yaitu sebelas unit kerja dengan 186 jenis aktivitas berulang,</w:t>
+        <w:t xml:space="preserve">unit kerja yang mengubah MPP, yaitu sebelas unit kerja dengan 186 jenis aktivitas</w:t>
       </w:r>
       <w:r>
         <w:rPr>
@@ -29674,7 +29702,7 @@
         <w:rPr>
           <w:lang w:val="id"/>
         </w:rPr>
-        <w:t xml:space="preserve">dari dokumen spreadsheet menjadi sistem kerja yang dapat diaudit.</w:t>
+        <w:t xml:space="preserve">berulang, dari dokumen spreadsheet menjadi sistem kerja yang dapat diaudit.</w:t>
       </w:r>
     </w:p>
     <w:p>

</xml_diff>